<commit_message>
Refonte CV : design nude/beige deux colonnes, contenu détaillé et optimisé CIP
https://claude.ai/code/session_01DPG1KTWB4ugR21iWQUT9rf
</commit_message>
<xml_diff>
--- a/CV_Louiza_Hadid_CIP.docx
+++ b/CV_Louiza_Hadid_CIP.docx
@@ -16,8 +16,7 @@
         </w:tblBorders>
       </w:tblPr>
       <w:tblGrid>
-        <w:gridCol w:w="4873"/>
-        <w:gridCol w:w="4873"/>
+        <w:gridCol w:w="10540"/>
       </w:tblGrid>
       <w:tr>
         <w:tc>
@@ -31,966 +30,58 @@
               <w:insideV w:val="none" w:sz="0" w:space="0" w:color="auto"/>
             </w:tcBorders>
             <w:vAlign w:val="top"/>
-            <w:tcW w:w="5953" w:type="dxa"/>
+            <w:tcW w:w="10206" w:type="dxa"/>
+            <w:shd w:val="clear" w:color="auto" w:fill="C4A882"/>
+            <w:tcMar>
+              <w:top w:w="255" w:type="dxa"/>
+              <w:bottom w:w="226" w:type="dxa"/>
+              <w:left w:w="311" w:type="dxa"/>
+              <w:right w:w="311" w:type="dxa"/>
+            </w:tcMar>
           </w:tcPr>
           <w:p>
             <w:pPr>
-              <w:spacing w:before="0" w:after="60"/>
+              <w:spacing w:before="0" w:after="80"/>
             </w:pPr>
             <w:r>
               <w:rPr>
                 <w:rFonts w:ascii="Calibri" w:hAnsi="Calibri"/>
                 <w:b/>
                 <w:i w:val="0"/>
-                <w:color w:val="000000"/>
-                <w:sz w:val="44"/>
+                <w:color w:val="FFFFFF"/>
+                <w:sz w:val="48"/>
               </w:rPr>
               <w:t>Louiza Hadid</w:t>
             </w:r>
           </w:p>
           <w:p>
             <w:pPr>
-              <w:spacing w:before="0" w:after="0"/>
-              <w:jc w:val="left"/>
+              <w:spacing w:before="0" w:after="200"/>
             </w:pPr>
             <w:r>
               <w:rPr>
                 <w:rFonts w:ascii="Calibri" w:hAnsi="Calibri"/>
                 <w:b w:val="0"/>
                 <w:i/>
-                <w:color w:val="6E6E6E"/>
-                <w:sz w:val="22"/>
+                <w:color w:val="FFF4E4"/>
+                <w:sz w:val="24"/>
               </w:rPr>
               <w:t>Conseillère en insertion professionnelle</w:t>
             </w:r>
           </w:p>
-        </w:tc>
-        <w:tc>
-          <w:tcPr>
-            <w:tcBorders>
-              <w:top w:val="none" w:sz="0" w:space="0" w:color="auto"/>
-              <w:left w:val="none" w:sz="0" w:space="0" w:color="auto"/>
-              <w:bottom w:val="none" w:sz="0" w:space="0" w:color="auto"/>
-              <w:right w:val="none" w:sz="0" w:space="0" w:color="auto"/>
-              <w:insideH w:val="none" w:sz="0" w:space="0" w:color="auto"/>
-              <w:insideV w:val="none" w:sz="0" w:space="0" w:color="auto"/>
-            </w:tcBorders>
-            <w:vAlign w:val="top"/>
-            <w:tcW w:w="3402" w:type="dxa"/>
-          </w:tcPr>
           <w:p>
             <w:pPr>
-              <w:spacing w:before="0" w:after="20"/>
-              <w:jc w:val="right"/>
+              <w:spacing w:before="0" w:after="0"/>
             </w:pPr>
             <w:r>
               <w:rPr>
                 <w:rFonts w:ascii="Calibri" w:hAnsi="Calibri"/>
                 <w:b w:val="0"/>
                 <w:i w:val="0"/>
-                <w:color w:val="6E6E6E"/>
-                <w:sz w:val="20"/>
+                <w:color w:val="F0E4D2"/>
+                <w:sz w:val="18"/>
               </w:rPr>
-              <w:t>06 50 37 56 47</w:t>
-            </w:r>
-          </w:p>
-          <w:p>
-            <w:pPr>
-              <w:spacing w:before="0" w:after="20"/>
-              <w:jc w:val="right"/>
-            </w:pPr>
-            <w:r>
-              <w:rPr>
-                <w:rFonts w:ascii="Calibri" w:hAnsi="Calibri"/>
-                <w:b w:val="0"/>
-                <w:i w:val="0"/>
-                <w:color w:val="6E6E6E"/>
-                <w:sz w:val="20"/>
-              </w:rPr>
-              <w:t>louizahdd@gmail.com</w:t>
-            </w:r>
-          </w:p>
-          <w:p>
-            <w:pPr>
-              <w:spacing w:before="0" w:after="20"/>
-              <w:jc w:val="right"/>
-            </w:pPr>
-            <w:r>
-              <w:rPr>
-                <w:rFonts w:ascii="Calibri" w:hAnsi="Calibri"/>
-                <w:b w:val="0"/>
-                <w:i w:val="0"/>
-                <w:color w:val="6E6E6E"/>
-                <w:sz w:val="20"/>
-              </w:rPr>
-              <w:t>3 rue de Ventspils — 56100 Lorient</w:t>
-            </w:r>
-          </w:p>
-          <w:p>
-            <w:pPr>
-              <w:spacing w:before="0" w:after="20"/>
-              <w:jc w:val="right"/>
-            </w:pPr>
-            <w:r>
-              <w:rPr>
-                <w:rFonts w:ascii="Calibri" w:hAnsi="Calibri"/>
-                <w:b w:val="0"/>
-                <w:i w:val="0"/>
-                <w:color w:val="6E6E6E"/>
-                <w:sz w:val="20"/>
-              </w:rPr>
-              <w:t>Permis B</w:t>
-            </w:r>
-          </w:p>
-        </w:tc>
-      </w:tr>
-    </w:tbl>
-    <w:p>
-      <w:pPr>
-        <w:spacing w:before="160" w:after="0"/>
-        <w:pBdr>
-          <w:bottom w:val="single" w:sz="6" w:space="1" w:color="000000"/>
-        </w:pBdr>
-      </w:pPr>
-    </w:p>
-    <w:p>
-      <w:pPr>
-        <w:spacing w:before="200" w:after="60"/>
-        <w:pBdr>
-          <w:bottom w:val="single" w:sz="4" w:space="1" w:color="000000"/>
-        </w:pBdr>
-      </w:pPr>
-      <w:r>
-        <w:rPr>
-          <w:rFonts w:ascii="Calibri" w:hAnsi="Calibri"/>
-          <w:b/>
-          <w:i w:val="0"/>
-          <w:color w:val="000000"/>
-          <w:sz w:val="21"/>
-        </w:rPr>
-        <w:t>PROFIL</w:t>
-      </w:r>
-    </w:p>
-    <w:p>
-      <w:pPr>
-        <w:spacing w:before="60" w:after="0"/>
-        <w:jc w:val="both"/>
-      </w:pPr>
-      <w:r>
-        <w:rPr>
-          <w:rFonts w:ascii="Calibri" w:hAnsi="Calibri"/>
-          <w:b w:val="0"/>
-          <w:i w:val="0"/>
-          <w:color w:val="000000"/>
-          <w:sz w:val="21"/>
-        </w:rPr>
-        <w:t>Diplômée d’une Licence Sciences de l’Éducation (Rennes 2, 2025) avec une spécialisation en action éducative et dispositifs d’insertion, j’ai développé une expérience solide dans l’accompagnement de publics diversifiés, l’entretien individuel et le suivi de parcours. Originaire de Lorient, je souhaite mettre ces compétences au service des jeunes de la Mission Locale du Pays de Lorient.</w:t>
-      </w:r>
-    </w:p>
-    <w:p>
-      <w:pPr>
-        <w:spacing w:before="200" w:after="60"/>
-        <w:pBdr>
-          <w:bottom w:val="single" w:sz="4" w:space="1" w:color="000000"/>
-        </w:pBdr>
-      </w:pPr>
-      <w:r>
-        <w:rPr>
-          <w:rFonts w:ascii="Calibri" w:hAnsi="Calibri"/>
-          <w:b/>
-          <w:i w:val="0"/>
-          <w:color w:val="000000"/>
-          <w:sz w:val="21"/>
-        </w:rPr>
-        <w:t>EXPÉRIENCES PROFESSIONNELLES</w:t>
-      </w:r>
-    </w:p>
-    <w:tbl>
-      <w:tblPr>
-        <w:tblW w:type="auto" w:w="0"/>
-        <w:tblLook w:firstColumn="1" w:firstRow="1" w:lastColumn="0" w:lastRow="0" w:noHBand="0" w:noVBand="1" w:val="04A0"/>
-        <w:tblBorders>
-          <w:top w:val="none" w:sz="0" w:space="0" w:color="auto"/>
-          <w:left w:val="none" w:sz="0" w:space="0" w:color="auto"/>
-          <w:bottom w:val="none" w:sz="0" w:space="0" w:color="auto"/>
-          <w:right w:val="none" w:sz="0" w:space="0" w:color="auto"/>
-          <w:insideH w:val="none" w:sz="0" w:space="0" w:color="auto"/>
-          <w:insideV w:val="none" w:sz="0" w:space="0" w:color="auto"/>
-        </w:tblBorders>
-      </w:tblPr>
-      <w:tblGrid>
-        <w:gridCol w:w="4873"/>
-        <w:gridCol w:w="4873"/>
-      </w:tblGrid>
-      <w:tr>
-        <w:tc>
-          <w:tcPr>
-            <w:tcBorders>
-              <w:top w:val="none" w:sz="0" w:space="0" w:color="auto"/>
-              <w:left w:val="none" w:sz="0" w:space="0" w:color="auto"/>
-              <w:bottom w:val="none" w:sz="0" w:space="0" w:color="auto"/>
-              <w:right w:val="none" w:sz="0" w:space="0" w:color="auto"/>
-              <w:insideH w:val="none" w:sz="0" w:space="0" w:color="auto"/>
-              <w:insideV w:val="none" w:sz="0" w:space="0" w:color="auto"/>
-            </w:tcBorders>
-            <w:vAlign w:val="top"/>
-            <w:tcW w:w="6520" w:type="dxa"/>
-          </w:tcPr>
-          <w:p>
-            <w:pPr>
-              <w:spacing w:before="140" w:after="20"/>
-            </w:pPr>
-            <w:r>
-              <w:rPr>
-                <w:rFonts w:ascii="Calibri" w:hAnsi="Calibri"/>
-                <w:b/>
-                <w:i w:val="0"/>
-                <w:color w:val="000000"/>
-                <w:sz w:val="21"/>
-              </w:rPr>
-              <w:t>Téléopératrice Recouvrement &amp; Auditrice (appels mystères)</w:t>
-            </w:r>
-          </w:p>
-          <w:p>
-            <w:pPr>
-              <w:spacing w:before="0" w:after="40"/>
-            </w:pPr>
-            <w:r>
-              <w:rPr>
-                <w:rFonts w:ascii="Calibri" w:hAnsi="Calibri"/>
-                <w:b w:val="0"/>
-                <w:i/>
-                <w:color w:val="6E6E6E"/>
-                <w:sz w:val="20"/>
-              </w:rPr>
-              <w:t>Télémaque – Groupe Pénélope — Caudan (56)</w:t>
-            </w:r>
-          </w:p>
-        </w:tc>
-        <w:tc>
-          <w:tcPr>
-            <w:tcBorders>
-              <w:top w:val="none" w:sz="0" w:space="0" w:color="auto"/>
-              <w:left w:val="none" w:sz="0" w:space="0" w:color="auto"/>
-              <w:bottom w:val="none" w:sz="0" w:space="0" w:color="auto"/>
-              <w:right w:val="none" w:sz="0" w:space="0" w:color="auto"/>
-              <w:insideH w:val="none" w:sz="0" w:space="0" w:color="auto"/>
-              <w:insideV w:val="none" w:sz="0" w:space="0" w:color="auto"/>
-            </w:tcBorders>
-            <w:vAlign w:val="top"/>
-            <w:tcW w:w="2835" w:type="dxa"/>
-          </w:tcPr>
-          <w:p>
-            <w:pPr>
-              <w:spacing w:before="140" w:after="20"/>
-              <w:jc w:val="right"/>
-            </w:pPr>
-            <w:r>
-              <w:rPr>
-                <w:rFonts w:ascii="Calibri" w:hAnsi="Calibri"/>
-                <w:b w:val="0"/>
-                <w:i w:val="0"/>
-                <w:color w:val="6E6E6E"/>
-                <w:sz w:val="20"/>
-              </w:rPr>
-              <w:t>Sept. 2025 – présent</w:t>
-            </w:r>
-          </w:p>
-        </w:tc>
-      </w:tr>
-    </w:tbl>
-    <w:p>
-      <w:pPr>
-        <w:spacing w:before="0" w:after="40"/>
-        <w:ind w:left="283"/>
-      </w:pPr>
-      <w:r>
-        <w:rPr>
-          <w:rFonts w:ascii="Calibri" w:hAnsi="Calibri"/>
-          <w:b w:val="0"/>
-          <w:i w:val="0"/>
-          <w:color w:val="000000"/>
-          <w:sz w:val="20"/>
-        </w:rPr>
-        <w:t>– Conduite d’entretiens téléphoniques, écoute et reformulation des situations</w:t>
-      </w:r>
-    </w:p>
-    <w:p>
-      <w:pPr>
-        <w:spacing w:before="0" w:after="40"/>
-        <w:ind w:left="283"/>
-      </w:pPr>
-      <w:r>
-        <w:rPr>
-          <w:rFonts w:ascii="Calibri" w:hAnsi="Calibri"/>
-          <w:b w:val="0"/>
-          <w:i w:val="0"/>
-          <w:color w:val="000000"/>
-          <w:sz w:val="20"/>
-        </w:rPr>
-        <w:t>– Évaluation de la qualité d’accueil (appels mystères) : observation, notation, reporting</w:t>
-      </w:r>
-    </w:p>
-    <w:p>
-      <w:pPr>
-        <w:spacing w:before="0" w:after="40"/>
-        <w:ind w:left="283"/>
-      </w:pPr>
-      <w:r>
-        <w:rPr>
-          <w:rFonts w:ascii="Calibri" w:hAnsi="Calibri"/>
-          <w:b w:val="0"/>
-          <w:i w:val="0"/>
-          <w:color w:val="000000"/>
-          <w:sz w:val="20"/>
-        </w:rPr>
-        <w:t>– Suivi administratif rigoureux des dossiers</w:t>
-      </w:r>
-    </w:p>
-    <w:tbl>
-      <w:tblPr>
-        <w:tblW w:type="auto" w:w="0"/>
-        <w:tblLook w:firstColumn="1" w:firstRow="1" w:lastColumn="0" w:lastRow="0" w:noHBand="0" w:noVBand="1" w:val="04A0"/>
-        <w:tblBorders>
-          <w:top w:val="none" w:sz="0" w:space="0" w:color="auto"/>
-          <w:left w:val="none" w:sz="0" w:space="0" w:color="auto"/>
-          <w:bottom w:val="none" w:sz="0" w:space="0" w:color="auto"/>
-          <w:right w:val="none" w:sz="0" w:space="0" w:color="auto"/>
-          <w:insideH w:val="none" w:sz="0" w:space="0" w:color="auto"/>
-          <w:insideV w:val="none" w:sz="0" w:space="0" w:color="auto"/>
-        </w:tblBorders>
-      </w:tblPr>
-      <w:tblGrid>
-        <w:gridCol w:w="4873"/>
-        <w:gridCol w:w="4873"/>
-      </w:tblGrid>
-      <w:tr>
-        <w:tc>
-          <w:tcPr>
-            <w:tcBorders>
-              <w:top w:val="none" w:sz="0" w:space="0" w:color="auto"/>
-              <w:left w:val="none" w:sz="0" w:space="0" w:color="auto"/>
-              <w:bottom w:val="none" w:sz="0" w:space="0" w:color="auto"/>
-              <w:right w:val="none" w:sz="0" w:space="0" w:color="auto"/>
-              <w:insideH w:val="none" w:sz="0" w:space="0" w:color="auto"/>
-              <w:insideV w:val="none" w:sz="0" w:space="0" w:color="auto"/>
-            </w:tcBorders>
-            <w:vAlign w:val="top"/>
-            <w:tcW w:w="6520" w:type="dxa"/>
-          </w:tcPr>
-          <w:p>
-            <w:pPr>
-              <w:spacing w:before="140" w:after="20"/>
-            </w:pPr>
-            <w:r>
-              <w:rPr>
-                <w:rFonts w:ascii="Calibri" w:hAnsi="Calibri"/>
-                <w:b/>
-                <w:i w:val="0"/>
-                <w:color w:val="000000"/>
-                <w:sz w:val="21"/>
-              </w:rPr>
-              <w:t>Chargée de Relation Client</w:t>
-            </w:r>
-          </w:p>
-          <w:p>
-            <w:pPr>
-              <w:spacing w:before="0" w:after="40"/>
-            </w:pPr>
-            <w:r>
-              <w:rPr>
-                <w:rFonts w:ascii="Calibri" w:hAnsi="Calibri"/>
-                <w:b w:val="0"/>
-                <w:i/>
-                <w:color w:val="6E6E6E"/>
-                <w:sz w:val="20"/>
-              </w:rPr>
-              <w:t>Foncia — Rennes</w:t>
-            </w:r>
-          </w:p>
-        </w:tc>
-        <w:tc>
-          <w:tcPr>
-            <w:tcBorders>
-              <w:top w:val="none" w:sz="0" w:space="0" w:color="auto"/>
-              <w:left w:val="none" w:sz="0" w:space="0" w:color="auto"/>
-              <w:bottom w:val="none" w:sz="0" w:space="0" w:color="auto"/>
-              <w:right w:val="none" w:sz="0" w:space="0" w:color="auto"/>
-              <w:insideH w:val="none" w:sz="0" w:space="0" w:color="auto"/>
-              <w:insideV w:val="none" w:sz="0" w:space="0" w:color="auto"/>
-            </w:tcBorders>
-            <w:vAlign w:val="top"/>
-            <w:tcW w:w="2835" w:type="dxa"/>
-          </w:tcPr>
-          <w:p>
-            <w:pPr>
-              <w:spacing w:before="140" w:after="20"/>
-              <w:jc w:val="right"/>
-            </w:pPr>
-            <w:r>
-              <w:rPr>
-                <w:rFonts w:ascii="Calibri" w:hAnsi="Calibri"/>
-                <w:b w:val="0"/>
-                <w:i w:val="0"/>
-                <w:color w:val="6E6E6E"/>
-                <w:sz w:val="20"/>
-              </w:rPr>
-              <w:t>Mai – sept. 2025</w:t>
-            </w:r>
-          </w:p>
-        </w:tc>
-      </w:tr>
-    </w:tbl>
-    <w:p>
-      <w:pPr>
-        <w:spacing w:before="0" w:after="40"/>
-        <w:ind w:left="283"/>
-      </w:pPr>
-      <w:r>
-        <w:rPr>
-          <w:rFonts w:ascii="Calibri" w:hAnsi="Calibri"/>
-          <w:b w:val="0"/>
-          <w:i w:val="0"/>
-          <w:color w:val="000000"/>
-          <w:sz w:val="20"/>
-        </w:rPr>
-        <w:t>– Accueil et orientation du public, gestion des demandes en face-à-face et par téléphone</w:t>
-      </w:r>
-    </w:p>
-    <w:p>
-      <w:pPr>
-        <w:spacing w:before="0" w:after="40"/>
-        <w:ind w:left="283"/>
-      </w:pPr>
-      <w:r>
-        <w:rPr>
-          <w:rFonts w:ascii="Calibri" w:hAnsi="Calibri"/>
-          <w:b w:val="0"/>
-          <w:i w:val="0"/>
-          <w:color w:val="000000"/>
-          <w:sz w:val="20"/>
-        </w:rPr>
-        <w:t>– Suivi individualisé des dossiers, rédaction de comptes rendus (Word, Excel)</w:t>
-      </w:r>
-    </w:p>
-    <w:tbl>
-      <w:tblPr>
-        <w:tblW w:type="auto" w:w="0"/>
-        <w:tblLook w:firstColumn="1" w:firstRow="1" w:lastColumn="0" w:lastRow="0" w:noHBand="0" w:noVBand="1" w:val="04A0"/>
-        <w:tblBorders>
-          <w:top w:val="none" w:sz="0" w:space="0" w:color="auto"/>
-          <w:left w:val="none" w:sz="0" w:space="0" w:color="auto"/>
-          <w:bottom w:val="none" w:sz="0" w:space="0" w:color="auto"/>
-          <w:right w:val="none" w:sz="0" w:space="0" w:color="auto"/>
-          <w:insideH w:val="none" w:sz="0" w:space="0" w:color="auto"/>
-          <w:insideV w:val="none" w:sz="0" w:space="0" w:color="auto"/>
-        </w:tblBorders>
-      </w:tblPr>
-      <w:tblGrid>
-        <w:gridCol w:w="4873"/>
-        <w:gridCol w:w="4873"/>
-      </w:tblGrid>
-      <w:tr>
-        <w:tc>
-          <w:tcPr>
-            <w:tcBorders>
-              <w:top w:val="none" w:sz="0" w:space="0" w:color="auto"/>
-              <w:left w:val="none" w:sz="0" w:space="0" w:color="auto"/>
-              <w:bottom w:val="none" w:sz="0" w:space="0" w:color="auto"/>
-              <w:right w:val="none" w:sz="0" w:space="0" w:color="auto"/>
-              <w:insideH w:val="none" w:sz="0" w:space="0" w:color="auto"/>
-              <w:insideV w:val="none" w:sz="0" w:space="0" w:color="auto"/>
-            </w:tcBorders>
-            <w:vAlign w:val="top"/>
-            <w:tcW w:w="6520" w:type="dxa"/>
-          </w:tcPr>
-          <w:p>
-            <w:pPr>
-              <w:spacing w:before="140" w:after="20"/>
-            </w:pPr>
-            <w:r>
-              <w:rPr>
-                <w:rFonts w:ascii="Calibri" w:hAnsi="Calibri"/>
-                <w:b/>
-                <w:i w:val="0"/>
-                <w:color w:val="000000"/>
-                <w:sz w:val="21"/>
-              </w:rPr>
-              <w:t>Bénévole — Tutorat de français pour allophones</w:t>
-            </w:r>
-          </w:p>
-          <w:p>
-            <w:pPr>
-              <w:spacing w:before="0" w:after="40"/>
-            </w:pPr>
-            <w:r>
-              <w:rPr>
-                <w:rFonts w:ascii="Calibri" w:hAnsi="Calibri"/>
-                <w:b w:val="0"/>
-                <w:i/>
-                <w:color w:val="6E6E6E"/>
-                <w:sz w:val="20"/>
-              </w:rPr>
-              <w:t>Association SupÉducation — Rennes</w:t>
-            </w:r>
-          </w:p>
-        </w:tc>
-        <w:tc>
-          <w:tcPr>
-            <w:tcBorders>
-              <w:top w:val="none" w:sz="0" w:space="0" w:color="auto"/>
-              <w:left w:val="none" w:sz="0" w:space="0" w:color="auto"/>
-              <w:bottom w:val="none" w:sz="0" w:space="0" w:color="auto"/>
-              <w:right w:val="none" w:sz="0" w:space="0" w:color="auto"/>
-              <w:insideH w:val="none" w:sz="0" w:space="0" w:color="auto"/>
-              <w:insideV w:val="none" w:sz="0" w:space="0" w:color="auto"/>
-            </w:tcBorders>
-            <w:vAlign w:val="top"/>
-            <w:tcW w:w="2835" w:type="dxa"/>
-          </w:tcPr>
-          <w:p>
-            <w:pPr>
-              <w:spacing w:before="140" w:after="20"/>
-              <w:jc w:val="right"/>
-            </w:pPr>
-            <w:r>
-              <w:rPr>
-                <w:rFonts w:ascii="Calibri" w:hAnsi="Calibri"/>
-                <w:b w:val="0"/>
-                <w:i w:val="0"/>
-                <w:color w:val="6E6E6E"/>
-                <w:sz w:val="20"/>
-              </w:rPr>
-              <w:t>Janv. – avr. 2024</w:t>
-            </w:r>
-          </w:p>
-        </w:tc>
-      </w:tr>
-    </w:tbl>
-    <w:p>
-      <w:pPr>
-        <w:spacing w:before="0" w:after="40"/>
-        <w:ind w:left="283"/>
-      </w:pPr>
-      <w:r>
-        <w:rPr>
-          <w:rFonts w:ascii="Calibri" w:hAnsi="Calibri"/>
-          <w:b w:val="0"/>
-          <w:i w:val="0"/>
-          <w:color w:val="000000"/>
-          <w:sz w:val="20"/>
-        </w:rPr>
-        <w:t>– Accompagnement individualisé à distance en petits groupes (4–6 personnes)</w:t>
-      </w:r>
-    </w:p>
-    <w:p>
-      <w:pPr>
-        <w:spacing w:before="0" w:after="40"/>
-        <w:ind w:left="283"/>
-      </w:pPr>
-      <w:r>
-        <w:rPr>
-          <w:rFonts w:ascii="Calibri" w:hAnsi="Calibri"/>
-          <w:b w:val="0"/>
-          <w:i w:val="0"/>
-          <w:color w:val="000000"/>
-          <w:sz w:val="20"/>
-        </w:rPr>
-        <w:t>– Adaptation pédagogique aux besoins et au niveau de chaque apprenant</w:t>
-      </w:r>
-    </w:p>
-    <w:p>
-      <w:pPr>
-        <w:spacing w:before="0" w:after="40"/>
-        <w:ind w:left="283"/>
-      </w:pPr>
-      <w:r>
-        <w:rPr>
-          <w:rFonts w:ascii="Calibri" w:hAnsi="Calibri"/>
-          <w:b w:val="0"/>
-          <w:i w:val="0"/>
-          <w:color w:val="000000"/>
-          <w:sz w:val="20"/>
-        </w:rPr>
-        <w:t>– Suivi de la progression et ajustement des méthodes (différenciation, écoute active)</w:t>
-      </w:r>
-    </w:p>
-    <w:tbl>
-      <w:tblPr>
-        <w:tblW w:type="auto" w:w="0"/>
-        <w:tblLook w:firstColumn="1" w:firstRow="1" w:lastColumn="0" w:lastRow="0" w:noHBand="0" w:noVBand="1" w:val="04A0"/>
-        <w:tblBorders>
-          <w:top w:val="none" w:sz="0" w:space="0" w:color="auto"/>
-          <w:left w:val="none" w:sz="0" w:space="0" w:color="auto"/>
-          <w:bottom w:val="none" w:sz="0" w:space="0" w:color="auto"/>
-          <w:right w:val="none" w:sz="0" w:space="0" w:color="auto"/>
-          <w:insideH w:val="none" w:sz="0" w:space="0" w:color="auto"/>
-          <w:insideV w:val="none" w:sz="0" w:space="0" w:color="auto"/>
-        </w:tblBorders>
-      </w:tblPr>
-      <w:tblGrid>
-        <w:gridCol w:w="4873"/>
-        <w:gridCol w:w="4873"/>
-      </w:tblGrid>
-      <w:tr>
-        <w:tc>
-          <w:tcPr>
-            <w:tcBorders>
-              <w:top w:val="none" w:sz="0" w:space="0" w:color="auto"/>
-              <w:left w:val="none" w:sz="0" w:space="0" w:color="auto"/>
-              <w:bottom w:val="none" w:sz="0" w:space="0" w:color="auto"/>
-              <w:right w:val="none" w:sz="0" w:space="0" w:color="auto"/>
-              <w:insideH w:val="none" w:sz="0" w:space="0" w:color="auto"/>
-              <w:insideV w:val="none" w:sz="0" w:space="0" w:color="auto"/>
-            </w:tcBorders>
-            <w:vAlign w:val="top"/>
-            <w:tcW w:w="6520" w:type="dxa"/>
-          </w:tcPr>
-          <w:p>
-            <w:pPr>
-              <w:spacing w:before="140" w:after="20"/>
-            </w:pPr>
-            <w:r>
-              <w:rPr>
-                <w:rFonts w:ascii="Calibri" w:hAnsi="Calibri"/>
-                <w:b/>
-                <w:i w:val="0"/>
-                <w:color w:val="000000"/>
-                <w:sz w:val="21"/>
-              </w:rPr>
-              <w:t>Animatrice Périscolaire</w:t>
-            </w:r>
-          </w:p>
-          <w:p>
-            <w:pPr>
-              <w:spacing w:before="0" w:after="40"/>
-            </w:pPr>
-            <w:r>
-              <w:rPr>
-                <w:rFonts w:ascii="Calibri" w:hAnsi="Calibri"/>
-                <w:b w:val="0"/>
-                <w:i/>
-                <w:color w:val="6E6E6E"/>
-                <w:sz w:val="20"/>
-              </w:rPr>
-              <w:t>Mairie de Rennes – École REP — Rennes</w:t>
-            </w:r>
-          </w:p>
-        </w:tc>
-        <w:tc>
-          <w:tcPr>
-            <w:tcBorders>
-              <w:top w:val="none" w:sz="0" w:space="0" w:color="auto"/>
-              <w:left w:val="none" w:sz="0" w:space="0" w:color="auto"/>
-              <w:bottom w:val="none" w:sz="0" w:space="0" w:color="auto"/>
-              <w:right w:val="none" w:sz="0" w:space="0" w:color="auto"/>
-              <w:insideH w:val="none" w:sz="0" w:space="0" w:color="auto"/>
-              <w:insideV w:val="none" w:sz="0" w:space="0" w:color="auto"/>
-            </w:tcBorders>
-            <w:vAlign w:val="top"/>
-            <w:tcW w:w="2835" w:type="dxa"/>
-          </w:tcPr>
-          <w:p>
-            <w:pPr>
-              <w:spacing w:before="140" w:after="20"/>
-              <w:jc w:val="right"/>
-            </w:pPr>
-            <w:r>
-              <w:rPr>
-                <w:rFonts w:ascii="Calibri" w:hAnsi="Calibri"/>
-                <w:b w:val="0"/>
-                <w:i w:val="0"/>
-                <w:color w:val="6E6E6E"/>
-                <w:sz w:val="20"/>
-              </w:rPr>
-              <w:t>Janv. – mai 2023</w:t>
-            </w:r>
-          </w:p>
-        </w:tc>
-      </w:tr>
-    </w:tbl>
-    <w:p>
-      <w:pPr>
-        <w:spacing w:before="0" w:after="40"/>
-        <w:ind w:left="283"/>
-      </w:pPr>
-      <w:r>
-        <w:rPr>
-          <w:rFonts w:ascii="Calibri" w:hAnsi="Calibri"/>
-          <w:b w:val="0"/>
-          <w:i w:val="0"/>
-          <w:color w:val="000000"/>
-          <w:sz w:val="20"/>
-        </w:rPr>
-        <w:t>– Accueil et encadrement d’enfants en réseau d’éducation prioritaire</w:t>
-      </w:r>
-    </w:p>
-    <w:p>
-      <w:pPr>
-        <w:spacing w:before="0" w:after="40"/>
-        <w:ind w:left="283"/>
-      </w:pPr>
-      <w:r>
-        <w:rPr>
-          <w:rFonts w:ascii="Calibri" w:hAnsi="Calibri"/>
-          <w:b w:val="0"/>
-          <w:i w:val="0"/>
-          <w:color w:val="000000"/>
-          <w:sz w:val="20"/>
-        </w:rPr>
-        <w:t>– Gestion de publics diversifiés, adaptation aux besoins individuels</w:t>
-      </w:r>
-    </w:p>
-    <w:tbl>
-      <w:tblPr>
-        <w:tblW w:type="auto" w:w="0"/>
-        <w:tblLook w:firstColumn="1" w:firstRow="1" w:lastColumn="0" w:lastRow="0" w:noHBand="0" w:noVBand="1" w:val="04A0"/>
-        <w:tblBorders>
-          <w:top w:val="none" w:sz="0" w:space="0" w:color="auto"/>
-          <w:left w:val="none" w:sz="0" w:space="0" w:color="auto"/>
-          <w:bottom w:val="none" w:sz="0" w:space="0" w:color="auto"/>
-          <w:right w:val="none" w:sz="0" w:space="0" w:color="auto"/>
-          <w:insideH w:val="none" w:sz="0" w:space="0" w:color="auto"/>
-          <w:insideV w:val="none" w:sz="0" w:space="0" w:color="auto"/>
-        </w:tblBorders>
-      </w:tblPr>
-      <w:tblGrid>
-        <w:gridCol w:w="4873"/>
-        <w:gridCol w:w="4873"/>
-      </w:tblGrid>
-      <w:tr>
-        <w:tc>
-          <w:tcPr>
-            <w:tcBorders>
-              <w:top w:val="none" w:sz="0" w:space="0" w:color="auto"/>
-              <w:left w:val="none" w:sz="0" w:space="0" w:color="auto"/>
-              <w:bottom w:val="none" w:sz="0" w:space="0" w:color="auto"/>
-              <w:right w:val="none" w:sz="0" w:space="0" w:color="auto"/>
-              <w:insideH w:val="none" w:sz="0" w:space="0" w:color="auto"/>
-              <w:insideV w:val="none" w:sz="0" w:space="0" w:color="auto"/>
-            </w:tcBorders>
-            <w:vAlign w:val="top"/>
-            <w:tcW w:w="6520" w:type="dxa"/>
-          </w:tcPr>
-          <w:p>
-            <w:pPr>
-              <w:spacing w:before="140" w:after="20"/>
-            </w:pPr>
-            <w:r>
-              <w:rPr>
-                <w:rFonts w:ascii="Calibri" w:hAnsi="Calibri"/>
-                <w:b/>
-                <w:i w:val="0"/>
-                <w:color w:val="000000"/>
-                <w:sz w:val="21"/>
-              </w:rPr>
-              <w:t>Équipière → Formatrice → Chef d’équipe</w:t>
-            </w:r>
-          </w:p>
-          <w:p>
-            <w:pPr>
-              <w:spacing w:before="0" w:after="40"/>
-            </w:pPr>
-            <w:r>
-              <w:rPr>
-                <w:rFonts w:ascii="Calibri" w:hAnsi="Calibri"/>
-                <w:b w:val="0"/>
-                <w:i/>
-                <w:color w:val="6E6E6E"/>
-                <w:sz w:val="20"/>
-              </w:rPr>
-              <w:t>McDonald’s — Rennes</w:t>
-            </w:r>
-          </w:p>
-        </w:tc>
-        <w:tc>
-          <w:tcPr>
-            <w:tcBorders>
-              <w:top w:val="none" w:sz="0" w:space="0" w:color="auto"/>
-              <w:left w:val="none" w:sz="0" w:space="0" w:color="auto"/>
-              <w:bottom w:val="none" w:sz="0" w:space="0" w:color="auto"/>
-              <w:right w:val="none" w:sz="0" w:space="0" w:color="auto"/>
-              <w:insideH w:val="none" w:sz="0" w:space="0" w:color="auto"/>
-              <w:insideV w:val="none" w:sz="0" w:space="0" w:color="auto"/>
-            </w:tcBorders>
-            <w:vAlign w:val="top"/>
-            <w:tcW w:w="2835" w:type="dxa"/>
-          </w:tcPr>
-          <w:p>
-            <w:pPr>
-              <w:spacing w:before="140" w:after="20"/>
-              <w:jc w:val="right"/>
-            </w:pPr>
-            <w:r>
-              <w:rPr>
-                <w:rFonts w:ascii="Calibri" w:hAnsi="Calibri"/>
-                <w:b w:val="0"/>
-                <w:i w:val="0"/>
-                <w:color w:val="6E6E6E"/>
-                <w:sz w:val="20"/>
-              </w:rPr>
-              <w:t>Sept. 2021 – nov. 2022</w:t>
-            </w:r>
-          </w:p>
-        </w:tc>
-      </w:tr>
-    </w:tbl>
-    <w:p>
-      <w:pPr>
-        <w:spacing w:before="0" w:after="40"/>
-        <w:ind w:left="283"/>
-      </w:pPr>
-      <w:r>
-        <w:rPr>
-          <w:rFonts w:ascii="Calibri" w:hAnsi="Calibri"/>
-          <w:b w:val="0"/>
-          <w:i w:val="0"/>
-          <w:color w:val="000000"/>
-          <w:sz w:val="20"/>
-        </w:rPr>
-        <w:t>– Formation et intégration des nouveaux collaborateurs</w:t>
-      </w:r>
-    </w:p>
-    <w:p>
-      <w:pPr>
-        <w:spacing w:before="0" w:after="40"/>
-        <w:ind w:left="283"/>
-      </w:pPr>
-      <w:r>
-        <w:rPr>
-          <w:rFonts w:ascii="Calibri" w:hAnsi="Calibri"/>
-          <w:b w:val="0"/>
-          <w:i w:val="0"/>
-          <w:color w:val="000000"/>
-          <w:sz w:val="20"/>
-        </w:rPr>
-        <w:t>– Management d’équipe, coordination opérationnelle, gestion sous pression</w:t>
-      </w:r>
-    </w:p>
-    <w:p>
-      <w:pPr>
-        <w:spacing w:before="200" w:after="60"/>
-        <w:pBdr>
-          <w:bottom w:val="single" w:sz="4" w:space="1" w:color="000000"/>
-        </w:pBdr>
-      </w:pPr>
-      <w:r>
-        <w:rPr>
-          <w:rFonts w:ascii="Calibri" w:hAnsi="Calibri"/>
-          <w:b/>
-          <w:i w:val="0"/>
-          <w:color w:val="000000"/>
-          <w:sz w:val="21"/>
-        </w:rPr>
-        <w:t>FORMATION</w:t>
-      </w:r>
-    </w:p>
-    <w:tbl>
-      <w:tblPr>
-        <w:tblW w:type="auto" w:w="0"/>
-        <w:tblLook w:firstColumn="1" w:firstRow="1" w:lastColumn="0" w:lastRow="0" w:noHBand="0" w:noVBand="1" w:val="04A0"/>
-        <w:tblBorders>
-          <w:top w:val="none" w:sz="0" w:space="0" w:color="auto"/>
-          <w:left w:val="none" w:sz="0" w:space="0" w:color="auto"/>
-          <w:bottom w:val="none" w:sz="0" w:space="0" w:color="auto"/>
-          <w:right w:val="none" w:sz="0" w:space="0" w:color="auto"/>
-          <w:insideH w:val="none" w:sz="0" w:space="0" w:color="auto"/>
-          <w:insideV w:val="none" w:sz="0" w:space="0" w:color="auto"/>
-        </w:tblBorders>
-      </w:tblPr>
-      <w:tblGrid>
-        <w:gridCol w:w="4873"/>
-        <w:gridCol w:w="4873"/>
-      </w:tblGrid>
-      <w:tr>
-        <w:tc>
-          <w:tcPr>
-            <w:tcBorders>
-              <w:top w:val="none" w:sz="0" w:space="0" w:color="auto"/>
-              <w:left w:val="none" w:sz="0" w:space="0" w:color="auto"/>
-              <w:bottom w:val="none" w:sz="0" w:space="0" w:color="auto"/>
-              <w:right w:val="none" w:sz="0" w:space="0" w:color="auto"/>
-              <w:insideH w:val="none" w:sz="0" w:space="0" w:color="auto"/>
-              <w:insideV w:val="none" w:sz="0" w:space="0" w:color="auto"/>
-            </w:tcBorders>
-            <w:vAlign w:val="top"/>
-            <w:tcW w:w="6804" w:type="dxa"/>
-          </w:tcPr>
-          <w:p>
-            <w:pPr>
-              <w:spacing w:before="100" w:after="20"/>
-            </w:pPr>
-            <w:r>
-              <w:rPr>
-                <w:rFonts w:ascii="Calibri" w:hAnsi="Calibri"/>
-                <w:b/>
-                <w:i w:val="0"/>
-                <w:color w:val="000000"/>
-                <w:sz w:val="21"/>
-              </w:rPr>
-              <w:t>Licence Sciences de l’Éducation</w:t>
-            </w:r>
-          </w:p>
-          <w:p>
-            <w:pPr>
-              <w:spacing w:before="0" w:after="20"/>
-              <w:jc w:val="left"/>
-            </w:pPr>
-            <w:r>
-              <w:rPr>
-                <w:rFonts w:ascii="Calibri" w:hAnsi="Calibri"/>
-                <w:b w:val="0"/>
-                <w:i/>
-                <w:color w:val="6E6E6E"/>
-                <w:sz w:val="20"/>
-              </w:rPr>
-              <w:t>Université Rennes 2 — Option Action Éducation et Formation (2 semestres)</w:t>
-            </w:r>
-          </w:p>
-          <w:p>
-            <w:pPr>
-              <w:spacing w:before="0" w:after="0"/>
-              <w:jc w:val="left"/>
-            </w:pPr>
-            <w:r>
-              <w:rPr>
-                <w:rFonts w:ascii="Calibri" w:hAnsi="Calibri"/>
-                <w:b w:val="0"/>
-                <w:i w:val="0"/>
-                <w:color w:val="6E6E6E"/>
-                <w:sz w:val="20"/>
-              </w:rPr>
-              <w:t>Dispositifs d’insertion, politiques de formation, enquêtes terrain (observations en classe, entretiens enseignants et élèves)</w:t>
-            </w:r>
-          </w:p>
-        </w:tc>
-        <w:tc>
-          <w:tcPr>
-            <w:tcBorders>
-              <w:top w:val="none" w:sz="0" w:space="0" w:color="auto"/>
-              <w:left w:val="none" w:sz="0" w:space="0" w:color="auto"/>
-              <w:bottom w:val="none" w:sz="0" w:space="0" w:color="auto"/>
-              <w:right w:val="none" w:sz="0" w:space="0" w:color="auto"/>
-              <w:insideH w:val="none" w:sz="0" w:space="0" w:color="auto"/>
-              <w:insideV w:val="none" w:sz="0" w:space="0" w:color="auto"/>
-            </w:tcBorders>
-            <w:vAlign w:val="top"/>
-            <w:tcW w:w="2551" w:type="dxa"/>
-          </w:tcPr>
-          <w:p>
-            <w:pPr>
-              <w:spacing w:before="100" w:after="20"/>
-              <w:jc w:val="right"/>
-            </w:pPr>
-            <w:r>
-              <w:rPr>
-                <w:rFonts w:ascii="Calibri" w:hAnsi="Calibri"/>
-                <w:b w:val="0"/>
-                <w:i w:val="0"/>
-                <w:color w:val="6E6E6E"/>
-                <w:sz w:val="20"/>
-              </w:rPr>
-              <w:t>2022 – 2025</w:t>
+              <w:t>06 50 37 56 47  •  louizahdd@gmail.com  •  3 rue de Ventspils, 56100 Lorient  •  Permis B</w:t>
             </w:r>
           </w:p>
         </w:tc>
@@ -1010,8 +101,8 @@
         </w:tblBorders>
       </w:tblPr>
       <w:tblGrid>
-        <w:gridCol w:w="4873"/>
-        <w:gridCol w:w="4873"/>
+        <w:gridCol w:w="5270"/>
+        <w:gridCol w:w="5270"/>
       </w:tblGrid>
       <w:tr>
         <w:tc>
@@ -1025,8 +116,189 @@
               <w:insideV w:val="none" w:sz="0" w:space="0" w:color="auto"/>
             </w:tcBorders>
             <w:vAlign w:val="top"/>
-            <w:tcW w:w="6804" w:type="dxa"/>
+            <w:tcW w:w="3515" w:type="dxa"/>
+            <w:shd w:val="clear" w:color="auto" w:fill="EDE5D8"/>
+            <w:tcMar>
+              <w:top w:w="141" w:type="dxa"/>
+              <w:bottom w:w="141" w:type="dxa"/>
+              <w:left w:w="226" w:type="dxa"/>
+              <w:right w:w="170" w:type="dxa"/>
+            </w:tcMar>
           </w:tcPr>
+          <w:p>
+            <w:pPr>
+              <w:spacing w:before="180" w:after="80"/>
+              <w:pBdr>
+                <w:bottom w:val="single" w:sz="4" w:space="1" w:color="C4A882"/>
+              </w:pBdr>
+            </w:pPr>
+            <w:r>
+              <w:rPr>
+                <w:rFonts w:ascii="Calibri" w:hAnsi="Calibri"/>
+                <w:b/>
+                <w:color w:val="6E5232"/>
+                <w:sz w:val="17"/>
+              </w:rPr>
+              <w:t>FORMATION</w:t>
+            </w:r>
+          </w:p>
+          <w:p>
+            <w:pPr>
+              <w:spacing w:before="60" w:after="20"/>
+            </w:pPr>
+            <w:r>
+              <w:rPr>
+                <w:rFonts w:ascii="Calibri" w:hAnsi="Calibri"/>
+                <w:b/>
+                <w:i w:val="0"/>
+                <w:color w:val="2D2A26"/>
+                <w:sz w:val="18"/>
+              </w:rPr>
+              <w:t>Licence Sciences de l'Éducation</w:t>
+            </w:r>
+          </w:p>
+          <w:p>
+            <w:pPr>
+              <w:spacing w:before="0" w:after="0"/>
+            </w:pPr>
+            <w:r>
+              <w:rPr>
+                <w:rFonts w:ascii="Calibri" w:hAnsi="Calibri"/>
+                <w:b w:val="0"/>
+                <w:i w:val="0"/>
+                <w:color w:val="766E62"/>
+                <w:sz w:val="17"/>
+              </w:rPr>
+              <w:t>Université Rennes 2</w:t>
+            </w:r>
+          </w:p>
+          <w:p>
+            <w:pPr>
+              <w:spacing w:before="0" w:after="80"/>
+            </w:pPr>
+            <w:r>
+              <w:rPr>
+                <w:rFonts w:ascii="Calibri" w:hAnsi="Calibri"/>
+                <w:b w:val="0"/>
+                <w:i/>
+                <w:color w:val="766E62"/>
+                <w:sz w:val="17"/>
+              </w:rPr>
+              <w:t>2022 – 2025</w:t>
+            </w:r>
+          </w:p>
+          <w:p>
+            <w:pPr>
+              <w:spacing w:before="0" w:after="20"/>
+              <w:ind w:left="85"/>
+            </w:pPr>
+            <w:r>
+              <w:rPr>
+                <w:rFonts w:ascii="Calibri" w:hAnsi="Calibri"/>
+                <w:b w:val="0"/>
+                <w:i w:val="0"/>
+                <w:color w:val="2D2A26"/>
+                <w:sz w:val="17"/>
+              </w:rPr>
+              <w:t>Option : Action Éducation</w:t>
+            </w:r>
+          </w:p>
+          <w:p>
+            <w:pPr>
+              <w:spacing w:before="0" w:after="60"/>
+              <w:ind w:left="85"/>
+            </w:pPr>
+            <w:r>
+              <w:rPr>
+                <w:rFonts w:ascii="Calibri" w:hAnsi="Calibri"/>
+                <w:b w:val="0"/>
+                <w:i w:val="0"/>
+                <w:color w:val="2D2A26"/>
+                <w:sz w:val="17"/>
+              </w:rPr>
+              <w:t>et Formation (2 semestres)</w:t>
+            </w:r>
+          </w:p>
+          <w:p>
+            <w:pPr>
+              <w:spacing w:before="0" w:after="20"/>
+              <w:ind w:left="85"/>
+            </w:pPr>
+            <w:r>
+              <w:rPr>
+                <w:rFonts w:ascii="Calibri" w:hAnsi="Calibri"/>
+                <w:b w:val="0"/>
+                <w:i w:val="0"/>
+                <w:color w:val="2D2A26"/>
+                <w:sz w:val="17"/>
+              </w:rPr>
+              <w:t>· Dispositifs d'insertion (CEJ, CIVIS, apprentissage)</w:t>
+            </w:r>
+          </w:p>
+          <w:p>
+            <w:pPr>
+              <w:spacing w:before="0" w:after="20"/>
+              <w:ind w:left="85"/>
+            </w:pPr>
+            <w:r>
+              <w:rPr>
+                <w:rFonts w:ascii="Calibri" w:hAnsi="Calibri"/>
+                <w:b w:val="0"/>
+                <w:i w:val="0"/>
+                <w:color w:val="2D2A26"/>
+                <w:sz w:val="17"/>
+              </w:rPr>
+              <w:t>· Accompagnement des publics</w:t>
+            </w:r>
+          </w:p>
+          <w:p>
+            <w:pPr>
+              <w:spacing w:before="0" w:after="20"/>
+              <w:ind w:left="85"/>
+            </w:pPr>
+            <w:r>
+              <w:rPr>
+                <w:rFonts w:ascii="Calibri" w:hAnsi="Calibri"/>
+                <w:b w:val="0"/>
+                <w:i w:val="0"/>
+                <w:color w:val="2D2A26"/>
+                <w:sz w:val="17"/>
+              </w:rPr>
+              <w:t>· Psychologie du développement</w:t>
+            </w:r>
+          </w:p>
+          <w:p>
+            <w:pPr>
+              <w:spacing w:before="0" w:after="20"/>
+              <w:ind w:left="85"/>
+            </w:pPr>
+            <w:r>
+              <w:rPr>
+                <w:rFonts w:ascii="Calibri" w:hAnsi="Calibri"/>
+                <w:b w:val="0"/>
+                <w:i w:val="0"/>
+                <w:color w:val="2D2A26"/>
+                <w:sz w:val="17"/>
+              </w:rPr>
+              <w:t>· Enquêtes terrain : observations classe,</w:t>
+            </w:r>
+          </w:p>
+          <w:p>
+            <w:pPr>
+              <w:spacing w:before="0" w:after="20"/>
+              <w:ind w:left="85"/>
+            </w:pPr>
+            <w:r>
+              <w:rPr>
+                <w:rFonts w:ascii="Calibri" w:hAnsi="Calibri"/>
+                <w:b w:val="0"/>
+                <w:i w:val="0"/>
+                <w:color w:val="2D2A26"/>
+                <w:sz w:val="17"/>
+              </w:rPr>
+              <w:t xml:space="preserve">  entretiens enseignants &amp; élèves</w:t>
+            </w:r>
+          </w:p>
           <w:p>
             <w:pPr>
               <w:spacing w:before="100" w:after="20"/>
@@ -1036,8 +308,8 @@
                 <w:rFonts w:ascii="Calibri" w:hAnsi="Calibri"/>
                 <w:b/>
                 <w:i w:val="0"/>
-                <w:color w:val="000000"/>
-                <w:sz w:val="21"/>
+                <w:color w:val="2D2A26"/>
+                <w:sz w:val="18"/>
               </w:rPr>
               <w:t>Baccalauréat Général</w:t>
             </w:r>
@@ -1045,17 +317,260 @@
           <w:p>
             <w:pPr>
               <w:spacing w:before="0" w:after="0"/>
-              <w:jc w:val="left"/>
+            </w:pPr>
+            <w:r>
+              <w:rPr>
+                <w:rFonts w:ascii="Calibri" w:hAnsi="Calibri"/>
+                <w:b w:val="0"/>
+                <w:i w:val="0"/>
+                <w:color w:val="766E62"/>
+                <w:sz w:val="17"/>
+              </w:rPr>
+              <w:t>Lycée Dupuy de Lôme — Lorient</w:t>
+            </w:r>
+          </w:p>
+          <w:p>
+            <w:pPr>
+              <w:spacing w:before="0" w:after="0"/>
             </w:pPr>
             <w:r>
               <w:rPr>
                 <w:rFonts w:ascii="Calibri" w:hAnsi="Calibri"/>
                 <w:b w:val="0"/>
                 <w:i/>
-                <w:color w:val="6E6E6E"/>
-                <w:sz w:val="20"/>
+                <w:color w:val="766E62"/>
+                <w:sz w:val="17"/>
               </w:rPr>
-              <w:t>Lycée Dupuy de Lôme — Lorient  |  Spécialités : SES · LLCER Anglais</w:t>
+              <w:t>2018 – 2021  ·  SES · LLCER Anglais</w:t>
+            </w:r>
+          </w:p>
+          <w:p>
+            <w:pPr>
+              <w:spacing w:before="180" w:after="80"/>
+              <w:pBdr>
+                <w:bottom w:val="single" w:sz="4" w:space="1" w:color="C4A882"/>
+              </w:pBdr>
+            </w:pPr>
+            <w:r>
+              <w:rPr>
+                <w:rFonts w:ascii="Calibri" w:hAnsi="Calibri"/>
+                <w:b/>
+                <w:color w:val="6E5232"/>
+                <w:sz w:val="17"/>
+              </w:rPr>
+              <w:t>COMPÉTENCES</w:t>
+            </w:r>
+          </w:p>
+          <w:p>
+            <w:pPr>
+              <w:spacing w:before="0" w:after="40"/>
+            </w:pPr>
+            <w:r>
+              <w:rPr>
+                <w:rFonts w:ascii="Calibri" w:hAnsi="Calibri"/>
+                <w:b w:val="0"/>
+                <w:i w:val="0"/>
+                <w:color w:val="2D2A26"/>
+                <w:sz w:val="18"/>
+              </w:rPr>
+              <w:t>· Écoute active et bienveillance</w:t>
+            </w:r>
+          </w:p>
+          <w:p>
+            <w:pPr>
+              <w:spacing w:before="0" w:after="40"/>
+            </w:pPr>
+            <w:r>
+              <w:rPr>
+                <w:rFonts w:ascii="Calibri" w:hAnsi="Calibri"/>
+                <w:b w:val="0"/>
+                <w:i w:val="0"/>
+                <w:color w:val="2D2A26"/>
+                <w:sz w:val="18"/>
+              </w:rPr>
+              <w:t>· Accompagnement individualisé</w:t>
+            </w:r>
+          </w:p>
+          <w:p>
+            <w:pPr>
+              <w:spacing w:before="0" w:after="40"/>
+            </w:pPr>
+            <w:r>
+              <w:rPr>
+                <w:rFonts w:ascii="Calibri" w:hAnsi="Calibri"/>
+                <w:b w:val="0"/>
+                <w:i w:val="0"/>
+                <w:color w:val="2D2A26"/>
+                <w:sz w:val="18"/>
+              </w:rPr>
+              <w:t>· Techniques d’entretien</w:t>
+            </w:r>
+          </w:p>
+          <w:p>
+            <w:pPr>
+              <w:spacing w:before="0" w:after="40"/>
+            </w:pPr>
+            <w:r>
+              <w:rPr>
+                <w:rFonts w:ascii="Calibri" w:hAnsi="Calibri"/>
+                <w:b w:val="0"/>
+                <w:i w:val="0"/>
+                <w:color w:val="2D2A26"/>
+                <w:sz w:val="18"/>
+              </w:rPr>
+              <w:t>· Suivi administratif de dossiers</w:t>
+            </w:r>
+          </w:p>
+          <w:p>
+            <w:pPr>
+              <w:spacing w:before="0" w:after="40"/>
+            </w:pPr>
+            <w:r>
+              <w:rPr>
+                <w:rFonts w:ascii="Calibri" w:hAnsi="Calibri"/>
+                <w:b w:val="0"/>
+                <w:i w:val="0"/>
+                <w:color w:val="2D2A26"/>
+                <w:sz w:val="18"/>
+              </w:rPr>
+              <w:t>· Animation de groupe</w:t>
+            </w:r>
+          </w:p>
+          <w:p>
+            <w:pPr>
+              <w:spacing w:before="0" w:after="40"/>
+            </w:pPr>
+            <w:r>
+              <w:rPr>
+                <w:rFonts w:ascii="Calibri" w:hAnsi="Calibri"/>
+                <w:b w:val="0"/>
+                <w:i w:val="0"/>
+                <w:color w:val="2D2A26"/>
+                <w:sz w:val="18"/>
+              </w:rPr>
+              <w:t>· Médiation et relationnel</w:t>
+            </w:r>
+          </w:p>
+          <w:p>
+            <w:pPr>
+              <w:spacing w:before="0" w:after="40"/>
+            </w:pPr>
+            <w:r>
+              <w:rPr>
+                <w:rFonts w:ascii="Calibri" w:hAnsi="Calibri"/>
+                <w:b w:val="0"/>
+                <w:i w:val="0"/>
+                <w:color w:val="2D2A26"/>
+                <w:sz w:val="18"/>
+              </w:rPr>
+              <w:t>· Travail en équipe</w:t>
+            </w:r>
+          </w:p>
+          <w:p>
+            <w:pPr>
+              <w:spacing w:before="0" w:after="40"/>
+            </w:pPr>
+            <w:r>
+              <w:rPr>
+                <w:rFonts w:ascii="Calibri" w:hAnsi="Calibri"/>
+                <w:b w:val="0"/>
+                <w:i w:val="0"/>
+                <w:color w:val="2D2A26"/>
+                <w:sz w:val="18"/>
+              </w:rPr>
+              <w:t>· Rigueur et organisation</w:t>
+            </w:r>
+          </w:p>
+          <w:p>
+            <w:pPr>
+              <w:spacing w:before="180" w:after="80"/>
+              <w:pBdr>
+                <w:bottom w:val="single" w:sz="4" w:space="1" w:color="C4A882"/>
+              </w:pBdr>
+            </w:pPr>
+            <w:r>
+              <w:rPr>
+                <w:rFonts w:ascii="Calibri" w:hAnsi="Calibri"/>
+                <w:b/>
+                <w:color w:val="6E5232"/>
+                <w:sz w:val="17"/>
+              </w:rPr>
+              <w:t>LANGUES &amp; OUTILS</w:t>
+            </w:r>
+          </w:p>
+          <w:p>
+            <w:pPr>
+              <w:spacing w:before="0" w:after="40"/>
+            </w:pPr>
+            <w:r>
+              <w:rPr>
+                <w:rFonts w:ascii="Calibri" w:hAnsi="Calibri"/>
+                <w:b w:val="0"/>
+                <w:i w:val="0"/>
+                <w:color w:val="2D2A26"/>
+                <w:sz w:val="18"/>
+              </w:rPr>
+              <w:t>· Français — natif</w:t>
+            </w:r>
+          </w:p>
+          <w:p>
+            <w:pPr>
+              <w:spacing w:before="0" w:after="40"/>
+            </w:pPr>
+            <w:r>
+              <w:rPr>
+                <w:rFonts w:ascii="Calibri" w:hAnsi="Calibri"/>
+                <w:b w:val="0"/>
+                <w:i w:val="0"/>
+                <w:color w:val="2D2A26"/>
+                <w:sz w:val="18"/>
+              </w:rPr>
+              <w:t>· Anglais — C1</w:t>
+            </w:r>
+          </w:p>
+          <w:p>
+            <w:pPr>
+              <w:spacing w:before="100" w:after="40"/>
+            </w:pPr>
+            <w:r>
+              <w:rPr>
+                <w:rFonts w:ascii="Calibri" w:hAnsi="Calibri"/>
+                <w:b/>
+                <w:i w:val="0"/>
+                <w:color w:val="2D2A26"/>
+                <w:sz w:val="18"/>
+              </w:rPr>
+              <w:t>Informatique</w:t>
+            </w:r>
+          </w:p>
+          <w:p>
+            <w:pPr>
+              <w:spacing w:before="0" w:after="40"/>
+            </w:pPr>
+            <w:r>
+              <w:rPr>
+                <w:rFonts w:ascii="Calibri" w:hAnsi="Calibri"/>
+                <w:b w:val="0"/>
+                <w:i w:val="0"/>
+                <w:color w:val="2D2A26"/>
+                <w:sz w:val="18"/>
+              </w:rPr>
+              <w:t>· Pack Office (Word, Excel)</w:t>
+            </w:r>
+          </w:p>
+          <w:p>
+            <w:pPr>
+              <w:spacing w:before="0" w:after="40"/>
+            </w:pPr>
+            <w:r>
+              <w:rPr>
+                <w:rFonts w:ascii="Calibri" w:hAnsi="Calibri"/>
+                <w:b w:val="0"/>
+                <w:i w:val="0"/>
+                <w:color w:val="2D2A26"/>
+                <w:sz w:val="18"/>
+              </w:rPr>
+              <w:t>· Outils collaboratifs en ligne</w:t>
             </w:r>
           </w:p>
         </w:tc>
@@ -1070,263 +585,503 @@
               <w:insideV w:val="none" w:sz="0" w:space="0" w:color="auto"/>
             </w:tcBorders>
             <w:vAlign w:val="top"/>
-            <w:tcW w:w="2551" w:type="dxa"/>
+            <w:tcW w:w="6690" w:type="dxa"/>
+            <w:shd w:val="clear" w:color="auto" w:fill="FDFAF6"/>
+            <w:tcMar>
+              <w:top w:w="141" w:type="dxa"/>
+              <w:bottom w:w="141" w:type="dxa"/>
+              <w:left w:w="255" w:type="dxa"/>
+              <w:right w:w="226" w:type="dxa"/>
+            </w:tcMar>
           </w:tcPr>
           <w:p>
             <w:pPr>
-              <w:spacing w:before="100" w:after="20"/>
-              <w:jc w:val="right"/>
+              <w:spacing w:before="180" w:after="80"/>
+              <w:pBdr>
+                <w:bottom w:val="single" w:sz="4" w:space="1" w:color="C4A882"/>
+              </w:pBdr>
+            </w:pPr>
+            <w:r>
+              <w:rPr>
+                <w:rFonts w:ascii="Calibri" w:hAnsi="Calibri"/>
+                <w:b/>
+                <w:color w:val="6E5232"/>
+                <w:sz w:val="19"/>
+              </w:rPr>
+              <w:t>PROFIL</w:t>
+            </w:r>
+          </w:p>
+          <w:p>
+            <w:pPr>
+              <w:spacing w:before="40" w:after="0"/>
+              <w:jc w:val="both"/>
             </w:pPr>
             <w:r>
               <w:rPr>
                 <w:rFonts w:ascii="Calibri" w:hAnsi="Calibri"/>
                 <w:b w:val="0"/>
                 <w:i w:val="0"/>
-                <w:color w:val="6E6E6E"/>
-                <w:sz w:val="20"/>
+                <w:color w:val="2D2A26"/>
+                <w:sz w:val="19"/>
               </w:rPr>
-              <w:t>2018 – 2021</w:t>
+              <w:t>Diplômée d’une Licence Sciences de l’Éducation, je suis rigoureuse, organisée et dotée d’un sens aigu de l’écoute. Mes expériences dans l’animation en milieu prioritaire, la relation client et le tutorat de publics allophones m’ont appris à adapter mon approche, à gérer des situations complexes et à assurer un suivi individualisé. Familiarisée avec les dispositifs d’insertion grâce à ma formation, je suis motivée à mettre mes compétences au service des jeunes de la Mission Locale du Pays de Lorient.</w:t>
             </w:r>
           </w:p>
-        </w:tc>
-      </w:tr>
-    </w:tbl>
-    <w:p>
-      <w:pPr>
-        <w:spacing w:before="200" w:after="60"/>
-        <w:pBdr>
-          <w:bottom w:val="single" w:sz="4" w:space="1" w:color="000000"/>
-        </w:pBdr>
-      </w:pPr>
-      <w:r>
-        <w:rPr>
-          <w:rFonts w:ascii="Calibri" w:hAnsi="Calibri"/>
-          <w:b/>
-          <w:i w:val="0"/>
-          <w:color w:val="000000"/>
-          <w:sz w:val="21"/>
-        </w:rPr>
-        <w:t>COMPÉTENCES</w:t>
-      </w:r>
-    </w:p>
-    <w:tbl>
-      <w:tblPr>
-        <w:tblW w:type="auto" w:w="0"/>
-        <w:tblLook w:firstColumn="1" w:firstRow="1" w:lastColumn="0" w:lastRow="0" w:noHBand="0" w:noVBand="1" w:val="04A0"/>
-        <w:tblBorders>
-          <w:top w:val="none" w:sz="0" w:space="0" w:color="auto"/>
-          <w:left w:val="none" w:sz="0" w:space="0" w:color="auto"/>
-          <w:bottom w:val="none" w:sz="0" w:space="0" w:color="auto"/>
-          <w:right w:val="none" w:sz="0" w:space="0" w:color="auto"/>
-          <w:insideH w:val="none" w:sz="0" w:space="0" w:color="auto"/>
-          <w:insideV w:val="none" w:sz="0" w:space="0" w:color="auto"/>
-        </w:tblBorders>
-      </w:tblPr>
-      <w:tblGrid>
-        <w:gridCol w:w="3249"/>
-        <w:gridCol w:w="3249"/>
-        <w:gridCol w:w="3249"/>
-      </w:tblGrid>
-      <w:tr>
-        <w:tc>
-          <w:tcPr>
-            <w:tcBorders>
-              <w:top w:val="none" w:sz="0" w:space="0" w:color="auto"/>
-              <w:left w:val="none" w:sz="0" w:space="0" w:color="auto"/>
-              <w:bottom w:val="none" w:sz="0" w:space="0" w:color="auto"/>
-              <w:right w:val="none" w:sz="0" w:space="0" w:color="auto"/>
-              <w:insideH w:val="none" w:sz="0" w:space="0" w:color="auto"/>
-              <w:insideV w:val="none" w:sz="0" w:space="0" w:color="auto"/>
-            </w:tcBorders>
-            <w:vAlign w:val="top"/>
-            <w:tcW w:w="3118" w:type="dxa"/>
-          </w:tcPr>
           <w:p>
             <w:pPr>
-              <w:spacing w:before="80" w:after="40"/>
-              <w:jc w:val="left"/>
+              <w:spacing w:before="180" w:after="80"/>
+              <w:pBdr>
+                <w:bottom w:val="single" w:sz="4" w:space="1" w:color="C4A882"/>
+              </w:pBdr>
+            </w:pPr>
+            <w:r>
+              <w:rPr>
+                <w:rFonts w:ascii="Calibri" w:hAnsi="Calibri"/>
+                <w:b/>
+                <w:color w:val="6E5232"/>
+                <w:sz w:val="19"/>
+              </w:rPr>
+              <w:t>EXPÉRIENCES PROFESSIONNELLES</w:t>
+            </w:r>
+          </w:p>
+          <w:p>
+            <w:pPr>
+              <w:spacing w:before="120" w:after="0"/>
             </w:pPr>
             <w:r>
               <w:rPr>
                 <w:rFonts w:ascii="Calibri" w:hAnsi="Calibri"/>
                 <w:b/>
                 <w:i w:val="0"/>
-                <w:color w:val="000000"/>
-                <w:sz w:val="21"/>
+                <w:color w:val="2D2A26"/>
+                <w:sz w:val="19"/>
               </w:rPr>
-              <w:t>Langues</w:t>
+              <w:t>Téléopératrice Recouvrement &amp; Auditrice</w:t>
+            </w:r>
+            <w:r>
+              <w:rPr>
+                <w:rFonts w:ascii="Calibri" w:hAnsi="Calibri"/>
+                <w:b w:val="0"/>
+                <w:i w:val="0"/>
+                <w:color w:val="766E62"/>
+                <w:sz w:val="18"/>
+              </w:rPr>
+              <w:t xml:space="preserve">  —  Sept. 2025 – présent</w:t>
             </w:r>
           </w:p>
           <w:p>
             <w:pPr>
-              <w:spacing w:before="0" w:after="20"/>
-              <w:jc w:val="left"/>
+              <w:spacing w:before="0" w:after="40"/>
+            </w:pPr>
+            <w:r>
+              <w:rPr>
+                <w:rFonts w:ascii="Calibri" w:hAnsi="Calibri"/>
+                <w:b w:val="0"/>
+                <w:i/>
+                <w:color w:val="766E62"/>
+                <w:sz w:val="18"/>
+              </w:rPr>
+              <w:t>Télémaque – Groupe Pénélope — Caudan (56)</w:t>
+            </w:r>
+          </w:p>
+          <w:p>
+            <w:pPr>
+              <w:spacing w:before="0" w:after="30"/>
+              <w:ind w:left="170"/>
             </w:pPr>
             <w:r>
               <w:rPr>
                 <w:rFonts w:ascii="Calibri" w:hAnsi="Calibri"/>
                 <w:b w:val="0"/>
                 <w:i w:val="0"/>
-                <w:color w:val="000000"/>
-                <w:sz w:val="20"/>
+                <w:color w:val="2D2A26"/>
+                <w:sz w:val="19"/>
               </w:rPr>
-              <w:t>• Français — natif</w:t>
+              <w:t>– Conduite d’appels entrants/sortants : écoute active, reformulation, recherche de solutions</w:t>
             </w:r>
           </w:p>
           <w:p>
             <w:pPr>
-              <w:spacing w:before="0" w:after="20"/>
-              <w:jc w:val="left"/>
+              <w:spacing w:before="0" w:after="30"/>
+              <w:ind w:left="170"/>
             </w:pPr>
             <w:r>
               <w:rPr>
                 <w:rFonts w:ascii="Calibri" w:hAnsi="Calibri"/>
                 <w:b w:val="0"/>
                 <w:i w:val="0"/>
-                <w:color w:val="000000"/>
-                <w:sz w:val="20"/>
+                <w:color w:val="2D2A26"/>
+                <w:sz w:val="19"/>
               </w:rPr>
-              <w:t>• Anglais — C1</w:t>
+              <w:t>– Appels mystères : évaluation qualité d’accueil, grille de notation, reporting</w:t>
             </w:r>
           </w:p>
-        </w:tc>
-        <w:tc>
-          <w:tcPr>
-            <w:tcBorders>
-              <w:top w:val="none" w:sz="0" w:space="0" w:color="auto"/>
-              <w:left w:val="none" w:sz="0" w:space="0" w:color="auto"/>
-              <w:bottom w:val="none" w:sz="0" w:space="0" w:color="auto"/>
-              <w:right w:val="none" w:sz="0" w:space="0" w:color="auto"/>
-              <w:insideH w:val="none" w:sz="0" w:space="0" w:color="auto"/>
-              <w:insideV w:val="none" w:sz="0" w:space="0" w:color="auto"/>
-            </w:tcBorders>
-            <w:vAlign w:val="top"/>
-            <w:tcW w:w="3118" w:type="dxa"/>
-          </w:tcPr>
           <w:p>
             <w:pPr>
-              <w:spacing w:before="80" w:after="40"/>
-              <w:jc w:val="left"/>
+              <w:spacing w:before="0" w:after="30"/>
+              <w:ind w:left="170"/>
+            </w:pPr>
+            <w:r>
+              <w:rPr>
+                <w:rFonts w:ascii="Calibri" w:hAnsi="Calibri"/>
+                <w:b w:val="0"/>
+                <w:i w:val="0"/>
+                <w:color w:val="2D2A26"/>
+                <w:sz w:val="19"/>
+              </w:rPr>
+              <w:t>– Suivi administratif rigoureux des dossiers (saisie, mise à jour, classement)</w:t>
+            </w:r>
+          </w:p>
+          <w:p>
+            <w:pPr>
+              <w:spacing w:before="120" w:after="0"/>
             </w:pPr>
             <w:r>
               <w:rPr>
                 <w:rFonts w:ascii="Calibri" w:hAnsi="Calibri"/>
                 <w:b/>
                 <w:i w:val="0"/>
-                <w:color w:val="000000"/>
-                <w:sz w:val="21"/>
+                <w:color w:val="2D2A26"/>
+                <w:sz w:val="19"/>
               </w:rPr>
-              <w:t>Informatique</w:t>
+              <w:t>Chargée de Relation Client</w:t>
+            </w:r>
+            <w:r>
+              <w:rPr>
+                <w:rFonts w:ascii="Calibri" w:hAnsi="Calibri"/>
+                <w:b w:val="0"/>
+                <w:i w:val="0"/>
+                <w:color w:val="766E62"/>
+                <w:sz w:val="18"/>
+              </w:rPr>
+              <w:t xml:space="preserve">  —  Mai – sept. 2025</w:t>
             </w:r>
           </w:p>
           <w:p>
             <w:pPr>
-              <w:spacing w:before="0" w:after="20"/>
-              <w:jc w:val="left"/>
+              <w:spacing w:before="0" w:after="40"/>
+            </w:pPr>
+            <w:r>
+              <w:rPr>
+                <w:rFonts w:ascii="Calibri" w:hAnsi="Calibri"/>
+                <w:b w:val="0"/>
+                <w:i/>
+                <w:color w:val="766E62"/>
+                <w:sz w:val="18"/>
+              </w:rPr>
+              <w:t>Foncia — Rennes</w:t>
+            </w:r>
+          </w:p>
+          <w:p>
+            <w:pPr>
+              <w:spacing w:before="0" w:after="30"/>
+              <w:ind w:left="170"/>
             </w:pPr>
             <w:r>
               <w:rPr>
                 <w:rFonts w:ascii="Calibri" w:hAnsi="Calibri"/>
                 <w:b w:val="0"/>
                 <w:i w:val="0"/>
-                <w:color w:val="000000"/>
-                <w:sz w:val="20"/>
+                <w:color w:val="2D2A26"/>
+                <w:sz w:val="19"/>
               </w:rPr>
-              <w:t>• Pack Office (Word, Excel)</w:t>
+              <w:t>– Accueil physique et téléphonique, orientation et traitement des demandes</w:t>
             </w:r>
           </w:p>
           <w:p>
             <w:pPr>
-              <w:spacing w:before="0" w:after="20"/>
-              <w:jc w:val="left"/>
+              <w:spacing w:before="0" w:after="30"/>
+              <w:ind w:left="170"/>
             </w:pPr>
             <w:r>
               <w:rPr>
                 <w:rFonts w:ascii="Calibri" w:hAnsi="Calibri"/>
                 <w:b w:val="0"/>
                 <w:i w:val="0"/>
-                <w:color w:val="000000"/>
-                <w:sz w:val="20"/>
+                <w:color w:val="2D2A26"/>
+                <w:sz w:val="19"/>
               </w:rPr>
-              <w:t>• Outils collaboratifs en ligne</w:t>
+              <w:t>– Suivi individualisé des dossiers, rédaction de comptes rendus, Pack Office quotidien</w:t>
             </w:r>
           </w:p>
-        </w:tc>
-        <w:tc>
-          <w:tcPr>
-            <w:tcBorders>
-              <w:top w:val="none" w:sz="0" w:space="0" w:color="auto"/>
-              <w:left w:val="none" w:sz="0" w:space="0" w:color="auto"/>
-              <w:bottom w:val="none" w:sz="0" w:space="0" w:color="auto"/>
-              <w:right w:val="none" w:sz="0" w:space="0" w:color="auto"/>
-              <w:insideH w:val="none" w:sz="0" w:space="0" w:color="auto"/>
-              <w:insideV w:val="none" w:sz="0" w:space="0" w:color="auto"/>
-            </w:tcBorders>
-            <w:vAlign w:val="top"/>
-            <w:tcW w:w="3118" w:type="dxa"/>
-          </w:tcPr>
           <w:p>
             <w:pPr>
-              <w:spacing w:before="80" w:after="40"/>
-              <w:jc w:val="left"/>
+              <w:spacing w:before="0" w:after="30"/>
+              <w:ind w:left="170"/>
+            </w:pPr>
+            <w:r>
+              <w:rPr>
+                <w:rFonts w:ascii="Calibri" w:hAnsi="Calibri"/>
+                <w:b w:val="0"/>
+                <w:i w:val="0"/>
+                <w:color w:val="2D2A26"/>
+                <w:sz w:val="19"/>
+              </w:rPr>
+              <w:t>– Gestion de situations parfois conflictuelles avec calme et professionnalisme</w:t>
+            </w:r>
+          </w:p>
+          <w:p>
+            <w:pPr>
+              <w:spacing w:before="120" w:after="0"/>
             </w:pPr>
             <w:r>
               <w:rPr>
                 <w:rFonts w:ascii="Calibri" w:hAnsi="Calibri"/>
                 <w:b/>
                 <w:i w:val="0"/>
-                <w:color w:val="000000"/>
-                <w:sz w:val="21"/>
+                <w:color w:val="2D2A26"/>
+                <w:sz w:val="19"/>
               </w:rPr>
-              <w:t>Autres</w:t>
+              <w:t>Bénévole — Tutorat de français pour allophones</w:t>
+            </w:r>
+            <w:r>
+              <w:rPr>
+                <w:rFonts w:ascii="Calibri" w:hAnsi="Calibri"/>
+                <w:b w:val="0"/>
+                <w:i w:val="0"/>
+                <w:color w:val="766E62"/>
+                <w:sz w:val="18"/>
+              </w:rPr>
+              <w:t xml:space="preserve">  —  Janv. – avr. 2024</w:t>
             </w:r>
           </w:p>
           <w:p>
             <w:pPr>
-              <w:spacing w:before="0" w:after="20"/>
-              <w:jc w:val="left"/>
+              <w:spacing w:before="0" w:after="40"/>
+            </w:pPr>
+            <w:r>
+              <w:rPr>
+                <w:rFonts w:ascii="Calibri" w:hAnsi="Calibri"/>
+                <w:b w:val="0"/>
+                <w:i/>
+                <w:color w:val="766E62"/>
+                <w:sz w:val="18"/>
+              </w:rPr>
+              <w:t>Association SupÉducation — Rennes</w:t>
+            </w:r>
+          </w:p>
+          <w:p>
+            <w:pPr>
+              <w:spacing w:before="0" w:after="30"/>
+              <w:ind w:left="170"/>
             </w:pPr>
             <w:r>
               <w:rPr>
                 <w:rFonts w:ascii="Calibri" w:hAnsi="Calibri"/>
                 <w:b w:val="0"/>
                 <w:i w:val="0"/>
-                <w:color w:val="000000"/>
-                <w:sz w:val="20"/>
+                <w:color w:val="2D2A26"/>
+                <w:sz w:val="19"/>
               </w:rPr>
-              <w:t>• Permis B</w:t>
+              <w:t>– Accompagnement individualisé en petits groupes (4–6 pers.) à distance</w:t>
             </w:r>
           </w:p>
           <w:p>
             <w:pPr>
-              <w:spacing w:before="0" w:after="20"/>
-              <w:jc w:val="left"/>
+              <w:spacing w:before="0" w:after="30"/>
+              <w:ind w:left="170"/>
             </w:pPr>
             <w:r>
               <w:rPr>
                 <w:rFonts w:ascii="Calibri" w:hAnsi="Calibri"/>
                 <w:b w:val="0"/>
                 <w:i w:val="0"/>
-                <w:color w:val="000000"/>
-                <w:sz w:val="20"/>
+                <w:color w:val="2D2A26"/>
+                <w:sz w:val="19"/>
               </w:rPr>
-              <w:t>• Dispositifs insertion (CEJ, CIVIS…)</w:t>
+              <w:t>– Adaptation pédagogique aux besoins de chaque apprenant, suivi de la progression</w:t>
             </w:r>
           </w:p>
           <w:p>
             <w:pPr>
-              <w:spacing w:before="0" w:after="20"/>
-              <w:jc w:val="left"/>
+              <w:spacing w:before="0" w:after="30"/>
+              <w:ind w:left="170"/>
             </w:pPr>
             <w:r>
               <w:rPr>
                 <w:rFonts w:ascii="Calibri" w:hAnsi="Calibri"/>
                 <w:b w:val="0"/>
                 <w:i w:val="0"/>
-                <w:color w:val="000000"/>
-                <w:sz w:val="20"/>
+                <w:color w:val="2D2A26"/>
+                <w:sz w:val="19"/>
               </w:rPr>
-              <w:t>• Connaissance public 16-25 ans</w:t>
+              <w:t>– Développement de l’écoute active, de la patience et de la médiation</w:t>
+            </w:r>
+          </w:p>
+          <w:p>
+            <w:pPr>
+              <w:spacing w:before="120" w:after="0"/>
+            </w:pPr>
+            <w:r>
+              <w:rPr>
+                <w:rFonts w:ascii="Calibri" w:hAnsi="Calibri"/>
+                <w:b/>
+                <w:i w:val="0"/>
+                <w:color w:val="2D2A26"/>
+                <w:sz w:val="19"/>
+              </w:rPr>
+              <w:t>Animatrice Périscolaire</w:t>
+            </w:r>
+            <w:r>
+              <w:rPr>
+                <w:rFonts w:ascii="Calibri" w:hAnsi="Calibri"/>
+                <w:b w:val="0"/>
+                <w:i w:val="0"/>
+                <w:color w:val="766E62"/>
+                <w:sz w:val="18"/>
+              </w:rPr>
+              <w:t xml:space="preserve">  —  Janv. – mai 2023</w:t>
+            </w:r>
+          </w:p>
+          <w:p>
+            <w:pPr>
+              <w:spacing w:before="0" w:after="40"/>
+            </w:pPr>
+            <w:r>
+              <w:rPr>
+                <w:rFonts w:ascii="Calibri" w:hAnsi="Calibri"/>
+                <w:b w:val="0"/>
+                <w:i/>
+                <w:color w:val="766E62"/>
+                <w:sz w:val="18"/>
+              </w:rPr>
+              <w:t>Mairie de Rennes – École REP — Rennes</w:t>
+            </w:r>
+          </w:p>
+          <w:p>
+            <w:pPr>
+              <w:spacing w:before="0" w:after="30"/>
+              <w:ind w:left="170"/>
+            </w:pPr>
+            <w:r>
+              <w:rPr>
+                <w:rFonts w:ascii="Calibri" w:hAnsi="Calibri"/>
+                <w:b w:val="0"/>
+                <w:i w:val="0"/>
+                <w:color w:val="2D2A26"/>
+                <w:sz w:val="19"/>
+              </w:rPr>
+              <w:t>– Accueil et encadrement d’enfants en réseau d’éducation prioritaire</w:t>
+            </w:r>
+          </w:p>
+          <w:p>
+            <w:pPr>
+              <w:spacing w:before="0" w:after="30"/>
+              <w:ind w:left="170"/>
+            </w:pPr>
+            <w:r>
+              <w:rPr>
+                <w:rFonts w:ascii="Calibri" w:hAnsi="Calibri"/>
+                <w:b w:val="0"/>
+                <w:i w:val="0"/>
+                <w:color w:val="2D2A26"/>
+                <w:sz w:val="19"/>
+              </w:rPr>
+              <w:t>– Adaptation aux publics diversifiés, maintien d’un cadre bienveillant et structurant</w:t>
+            </w:r>
+          </w:p>
+          <w:p>
+            <w:pPr>
+              <w:spacing w:before="0" w:after="30"/>
+              <w:ind w:left="170"/>
+            </w:pPr>
+            <w:r>
+              <w:rPr>
+                <w:rFonts w:ascii="Calibri" w:hAnsi="Calibri"/>
+                <w:b w:val="0"/>
+                <w:i w:val="0"/>
+                <w:color w:val="2D2A26"/>
+                <w:sz w:val="19"/>
+              </w:rPr>
+              <w:t>– Collaboration avec l’équipe pédagogique et lien avec les familles</w:t>
+            </w:r>
+          </w:p>
+          <w:p>
+            <w:pPr>
+              <w:spacing w:before="120" w:after="0"/>
+            </w:pPr>
+            <w:r>
+              <w:rPr>
+                <w:rFonts w:ascii="Calibri" w:hAnsi="Calibri"/>
+                <w:b/>
+                <w:i w:val="0"/>
+                <w:color w:val="2D2A26"/>
+                <w:sz w:val="19"/>
+              </w:rPr>
+              <w:t>Équipière → Formatrice → Chef d’équipe</w:t>
+            </w:r>
+            <w:r>
+              <w:rPr>
+                <w:rFonts w:ascii="Calibri" w:hAnsi="Calibri"/>
+                <w:b w:val="0"/>
+                <w:i w:val="0"/>
+                <w:color w:val="766E62"/>
+                <w:sz w:val="18"/>
+              </w:rPr>
+              <w:t xml:space="preserve">  —  Sept. 2021 – nov. 2022</w:t>
+            </w:r>
+          </w:p>
+          <w:p>
+            <w:pPr>
+              <w:spacing w:before="0" w:after="40"/>
+            </w:pPr>
+            <w:r>
+              <w:rPr>
+                <w:rFonts w:ascii="Calibri" w:hAnsi="Calibri"/>
+                <w:b w:val="0"/>
+                <w:i/>
+                <w:color w:val="766E62"/>
+                <w:sz w:val="18"/>
+              </w:rPr>
+              <w:t>McDonald’s — Rennes</w:t>
+            </w:r>
+          </w:p>
+          <w:p>
+            <w:pPr>
+              <w:spacing w:before="0" w:after="30"/>
+              <w:ind w:left="170"/>
+            </w:pPr>
+            <w:r>
+              <w:rPr>
+                <w:rFonts w:ascii="Calibri" w:hAnsi="Calibri"/>
+                <w:b w:val="0"/>
+                <w:i w:val="0"/>
+                <w:color w:val="2D2A26"/>
+                <w:sz w:val="19"/>
+              </w:rPr>
+              <w:t>– Formation et intégration des nouveaux collaborateurs à leurs postes</w:t>
+            </w:r>
+          </w:p>
+          <w:p>
+            <w:pPr>
+              <w:spacing w:before="0" w:after="30"/>
+              <w:ind w:left="170"/>
+            </w:pPr>
+            <w:r>
+              <w:rPr>
+                <w:rFonts w:ascii="Calibri" w:hAnsi="Calibri"/>
+                <w:b w:val="0"/>
+                <w:i w:val="0"/>
+                <w:color w:val="2D2A26"/>
+                <w:sz w:val="19"/>
+              </w:rPr>
+              <w:t>– Coordination et management d’équipe, gestion des priorités sous pression</w:t>
+            </w:r>
+          </w:p>
+          <w:p>
+            <w:pPr>
+              <w:spacing w:before="0" w:after="30"/>
+              <w:ind w:left="170"/>
+            </w:pPr>
+            <w:r>
+              <w:rPr>
+                <w:rFonts w:ascii="Calibri" w:hAnsi="Calibri"/>
+                <w:b w:val="0"/>
+                <w:i w:val="0"/>
+                <w:color w:val="2D2A26"/>
+                <w:sz w:val="19"/>
+              </w:rPr>
+              <w:t>– Progression rapide : équipière → formatrice → chef d’équipe en 14 mois</w:t>
             </w:r>
           </w:p>
         </w:tc>
@@ -1334,7 +1089,7 @@
     </w:tbl>
     <w:sectPr>
       <w:pgSz w:w="12240" w:h="15840"/>
-      <w:pgMar w:top="1020" w:right="1247" w:bottom="1020" w:left="1247" w:header="720" w:footer="720" w:gutter="0"/>
+      <w:pgMar w:top="850" w:right="850" w:bottom="850" w:left="850" w:header="720" w:footer="720" w:gutter="0"/>
       <w:cols w:space="720"/>
       <w:docGrid w:linePitch="360"/>
     </w:sectPr>
@@ -1710,7 +1465,7 @@
     </w:pPr>
     <w:rPr>
       <w:rFonts w:ascii="Calibri" w:hAnsi="Calibri"/>
-      <w:sz w:val="21"/>
+      <w:sz w:val="19"/>
     </w:rPr>
   </w:style>
   <w:style w:type="paragraph" w:styleId="Header">

</xml_diff>